<commit_message>
docs(charter): mark EXOTIC-CCR charter superseded
</commit_message>
<xml_diff>
--- a/docs/charters/Project_EXOTIC_CCR_Research_Charter.docx
+++ b/docs/charters/Project_EXOTIC_CCR_Research_Charter.docx
@@ -342,6 +342,131 @@
         <w:t>This charter distinguishes exact algebraic results from operator-theoretic, physical, and computational claims. No physical significance is presumed before the stated gates are passed.</w:t>
       </w:r>
     </w:p>
+    <w:tbl>
+      <w:tblPr>
+        <w:tblW w:type="dxa" w:w="9360"/>
+        <w:tblLayout w:type="fixed"/>
+        <w:tblLook w:firstColumn="1" w:firstRow="1" w:lastColumn="0" w:lastRow="0" w:noHBand="0" w:noVBand="1" w:val="04A0"/>
+        <w:tblInd w:w="0" w:type="dxa"/>
+        <w:tblBorders>
+          <w:top w:val="single" w:sz="14" w:space="0" w:color="A53939"/>
+          <w:left w:val="single" w:sz="14" w:space="0" w:color="A53939"/>
+          <w:bottom w:val="single" w:sz="14" w:space="0" w:color="A53939"/>
+          <w:right w:val="single" w:sz="14" w:space="0" w:color="A53939"/>
+          <w:insideH w:val="nil"/>
+          <w:insideV w:val="nil"/>
+        </w:tblBorders>
+      </w:tblPr>
+      <w:tblGrid>
+        <w:gridCol w:w="9360"/>
+      </w:tblGrid>
+      <w:tr>
+        <w:tc>
+          <w:tcPr>
+            <w:tcW w:type="dxa" w:w="9360"/>
+            <w:shd w:val="clear" w:color="auto" w:fill="FBEDED"/>
+            <w:tcMar>
+              <w:top w:w="150" w:type="dxa"/>
+              <w:left w:w="190" w:type="dxa"/>
+              <w:bottom w:w="150" w:type="dxa"/>
+              <w:right w:w="190" w:type="dxa"/>
+            </w:tcMar>
+            <w:vAlign w:val="center"/>
+          </w:tcPr>
+          <w:p>
+            <w:pPr>
+              <w:keepLines/>
+              <w:spacing w:before="0" w:after="80" w:line="240" w:lineRule="auto"/>
+              <w:jc w:val="left"/>
+            </w:pPr>
+            <w:r>
+              <w:rPr>
+                <w:rFonts w:ascii="Lato" w:hAnsi="Lato" w:eastAsia="Lato" w:cs="Lato"/>
+                <w:b/>
+                <w:sz w:val="21"/>
+                <w:color w:val="A53939"/>
+              </w:rPr>
+              <w:t>SUPERSEDED - HISTORICAL PLANNING ARTIFACT</w:t>
+            </w:r>
+          </w:p>
+          <w:p>
+            <w:pPr>
+              <w:keepLines/>
+              <w:spacing w:before="0" w:after="60" w:line="240" w:lineRule="auto"/>
+              <w:jc w:val="left"/>
+            </w:pPr>
+            <w:r>
+              <w:rPr>
+                <w:rFonts w:ascii="Noto Sans" w:hAnsi="Noto Sans" w:eastAsia="Noto Sans" w:cs="Noto Sans"/>
+                <w:b/>
+                <w:sz w:val="17"/>
+                <w:color w:val="A53939"/>
+              </w:rPr>
+              <w:t xml:space="preserve">Authority status. </w:t>
+            </w:r>
+            <w:r>
+              <w:rPr>
+                <w:rFonts w:ascii="Noto Sans" w:hAnsi="Noto Sans" w:eastAsia="Noto Sans" w:cs="Noto Sans"/>
+                <w:b w:val="0"/>
+                <w:sz w:val="17"/>
+                <w:color w:val="263746"/>
+              </w:rPr>
+              <w:t>This charter dated 20 July 2026 is retained for historical planning context only. It is not the current claim authority or publication-freeze authority.</w:t>
+            </w:r>
+          </w:p>
+          <w:p>
+            <w:pPr>
+              <w:keepLines/>
+              <w:spacing w:before="0" w:after="60" w:line="240" w:lineRule="auto"/>
+              <w:jc w:val="left"/>
+            </w:pPr>
+            <w:r>
+              <w:rPr>
+                <w:rFonts w:ascii="Noto Sans" w:hAnsi="Noto Sans" w:eastAsia="Noto Sans" w:cs="Noto Sans"/>
+                <w:b/>
+                <w:sz w:val="17"/>
+                <w:color w:val="A53939"/>
+              </w:rPr>
+              <w:t xml:space="preserve">Withdrawn / unverified statements. </w:t>
+            </w:r>
+            <w:r>
+              <w:rPr>
+                <w:rFonts w:ascii="Noto Sans" w:hAnsi="Noto Sans" w:eastAsia="Noto Sans" w:cs="Noto Sans"/>
+                <w:b w:val="0"/>
+                <w:sz w:val="17"/>
+                <w:color w:val="263746"/>
+              </w:rPr>
+              <w:t>Any statement here that the displayed rank-three Weyl psi is non-surjective or nonautomorphic, that H0 or H2 has an exact deficiency index or is not essentially self-adjoint, or that dual-flow dynamics yields a strong-CCR obstruction is withdrawn or unverified. It must not be cited as a current theorem-grade conclusion without a compiling Lean anchor.</w:t>
+            </w:r>
+          </w:p>
+          <w:p>
+            <w:pPr>
+              <w:keepLines/>
+              <w:spacing w:before="0" w:after="0" w:line="240" w:lineRule="auto"/>
+              <w:jc w:val="left"/>
+            </w:pPr>
+            <w:r>
+              <w:rPr>
+                <w:rFonts w:ascii="Noto Sans" w:hAnsi="Noto Sans" w:eastAsia="Noto Sans" w:cs="Noto Sans"/>
+                <w:b/>
+                <w:sz w:val="17"/>
+                <w:color w:val="A53939"/>
+              </w:rPr>
+              <w:t xml:space="preserve">Current governing surfaces. </w:t>
+            </w:r>
+            <w:r>
+              <w:rPr>
+                <w:rFonts w:ascii="Noto Sans" w:hAnsi="Noto Sans" w:eastAsia="Noto Sans" w:cs="Noto Sans"/>
+                <w:b w:val="0"/>
+                <w:sz w:val="17"/>
+                <w:color w:val="263746"/>
+              </w:rPr>
+              <w:t>Use the science README.md, INTEGRITY.md, the current A001 paper, and Lean commit b51b67d03515d44e1cb1309cf8721a7ecf7803b2. The current paper concerns only the canonical minimal operator H_X1_min.</w:t>
+            </w:r>
+          </w:p>
+        </w:tc>
+      </w:tr>
+    </w:tbl>
     <w:p>
       <w:r>
         <w:br w:type="page"/>

</xml_diff>